<commit_message>
Controle Total: use the owner's model photos in both editions
The owner's sheet of 12 AI photos is cropped and upscaled 4x with EDSR
(fotos_da_folha.py); montar_fotos.py fits nine of them into the book's
card and adds the missing arrows. The lying photo serves the lying
Kegel with its breathing arrows removed. Captions and steps now match
the photos where they show a variation (bench, straight-arm plank,
all-fours reverse Kegel, arms-forward squat), keeping the other option.
Cover and the arousal chart stay as drawings; the unused stick-figure
PNGs are gone.

Co-Authored-By: Claude Opus 5.5 <noreply@anthropic.com>
Claude-Session: https://claude.ai/code/session_01UFcr5H5D9pwq46fdUbm4qE
</commit_message>
<xml_diff>
--- a/renda-extra/produtos/controle-total/es-MX/ebook.docx
+++ b/renda-extra/produtos/controle-total/es-MX/ebook.docx
@@ -2737,7 +2737,7 @@
           <wp:inline distT="0" distB="0" distL="0" distR="0">
             <wp:extent cx="5334000" cy="3810000"/>
             <wp:effectExtent t="0" r="0" b="0" l="0"/>
-            <wp:docPr id="1" name="01-anatomia.png" descr="El piso pélvico visto de lado: una red de músculos entre el pubis y el coxis. La flecha muestra la dirección de la contracción, hacia arriba y hacia adentro." title="01-anatomia.png"/>
+            <wp:docPr id="1" name="01-anatomia.jpg" descr="El piso pélvico visto de lado: una red de músculos entre el pubis y el coxis. La flecha muestra la dirección de la contracción, hacia arriba y hacia adentro." title="01-anatomia.jpg"/>
             <wp:cNvGraphicFramePr>
               <a:graphicFrameLocks xmlns:a="http://schemas.openxmlformats.org/drawingml/2006/main" noChangeAspect="1"/>
             </wp:cNvGraphicFramePr>
@@ -4074,7 +4074,7 @@
           <wp:inline distT="0" distB="0" distL="0" distR="0">
             <wp:extent cx="5334000" cy="3810000"/>
             <wp:effectExtent t="0" r="0" b="0" l="0"/>
-            <wp:docPr id="1" name="02-kegel-deitado.png" descr="Acostado boca arriba, rodillas dobladas, pies en el piso. La flecha pequeña en el periné muestra la contracción: hacia arriba." title="02-kegel-deitado.png"/>
+            <wp:docPr id="1" name="02-kegel-deitado.jpg" descr="Acostado boca arriba, rodillas dobladas, pies en el piso. La flecha pequeña en el periné muestra la contracción: hacia arriba." title="02-kegel-deitado.jpg"/>
             <wp:cNvGraphicFramePr>
               <a:graphicFrameLocks xmlns:a="http://schemas.openxmlformats.org/drawingml/2006/main" noChangeAspect="1"/>
             </wp:cNvGraphicFramePr>
@@ -4420,7 +4420,7 @@
           <wp:inline distT="0" distB="0" distL="0" distR="0">
             <wp:extent cx="5334000" cy="3810000"/>
             <wp:effectExtent t="0" r="0" b="0" l="0"/>
-            <wp:docPr id="1" name="03-kegel-sentado.png" descr="Sentado en una silla, columna erguida, pies en el piso. La flecha muestra la contracción hacia arriba, ahora contra la gravedad." title="03-kegel-sentado.png"/>
+            <wp:docPr id="1" name="03-kegel-sentado.jpg" descr="Sentado en un banco, columna erguida, pies en el piso. Sirve cualquier silla firme. La flecha muestra la contracción hacia arriba, ahora contra la gravedad." title="03-kegel-sentado.jpg"/>
             <wp:cNvGraphicFramePr>
               <a:graphicFrameLocks xmlns:a="http://schemas.openxmlformats.org/drawingml/2006/main" noChangeAspect="1"/>
             </wp:cNvGraphicFramePr>
@@ -4469,7 +4469,7 @@
           <w:sz w:val="18"/>
           <w:szCs w:val="18"/>
         </w:rPr>
-        <w:t xml:space="preserve">Sentado en una silla, columna erguida, pies en el piso. La flecha muestra la contracción hacia arriba, ahora contra la gravedad.</w:t>
+        <w:t xml:space="preserve">Sentado en un banco, columna erguida, pies en el piso. Sirve cualquier silla firme. La flecha muestra la contracción hacia arriba, ahora contra la gravedad.</w:t>
       </w:r>
     </w:p>
     <w:p>
@@ -4783,7 +4783,7 @@
           <wp:inline distT="0" distB="0" distL="0" distR="0">
             <wp:extent cx="5334000" cy="3810000"/>
             <wp:effectExtent t="0" r="0" b="0" l="0"/>
-            <wp:docPr id="1" name="04-contracoes-rapidas.png" descr="De pie, tres flechas cortas hacia arriba: contrae fuerte 1 segundo, suelta 1 segundo, en secuencia." title="04-contracoes-rapidas.png"/>
+            <wp:docPr id="1" name="04-contracoes-rapidas.jpg" descr="De pie, tres flechas cortas hacia arriba: contrae fuerte 1 segundo, suelta 1 segundo, en secuencia." title="04-contracoes-rapidas.jpg"/>
             <wp:cNvGraphicFramePr>
               <a:graphicFrameLocks xmlns:a="http://schemas.openxmlformats.org/drawingml/2006/main" noChangeAspect="1"/>
             </wp:cNvGraphicFramePr>
@@ -5771,7 +5771,7 @@
           <wp:inline distT="0" distB="0" distL="0" distR="0">
             <wp:extent cx="5334000" cy="3810000"/>
             <wp:effectExtent t="0" r="0" b="0" l="0"/>
-            <wp:docPr id="1" name="05-kegel-reverso.png" descr="Acostado, la región del periné baja un poco. Es dejar caer, no pujar." title="05-kegel-reverso.png"/>
+            <wp:docPr id="1" name="05-kegel-reverso.jpg" descr="En cuatro puntos, como en la foto, o acostado boca arriba, como en los pasos: la región del periné baja un poco. Es dejar caer, no pujar." title="05-kegel-reverso.jpg"/>
             <wp:cNvGraphicFramePr>
               <a:graphicFrameLocks xmlns:a="http://schemas.openxmlformats.org/drawingml/2006/main" noChangeAspect="1"/>
             </wp:cNvGraphicFramePr>
@@ -5820,7 +5820,7 @@
           <w:sz w:val="18"/>
           <w:szCs w:val="18"/>
         </w:rPr>
-        <w:t xml:space="preserve">Acostado, la región del periné baja un poco. Es dejar caer, no pujar.</w:t>
+        <w:t xml:space="preserve">En cuatro puntos, como en la foto, o acostado boca arriba, como en los pasos: la región del periné baja un poco. Es dejar caer, no pujar.</w:t>
       </w:r>
     </w:p>
     <w:p>
@@ -6076,7 +6076,7 @@
           <w:sz w:val="22"/>
           <w:szCs w:val="22"/>
         </w:rPr>
-        <w:t xml:space="preserve">Si no logras sentir la soltura, haz una contracción ligera de 2 segundos y luego suelta. La diferencia se vuelve obvia. Con el tiempo irás directo al soltar.</w:t>
+        <w:t xml:space="preserve">Si no logras sentir la soltura, haz una contracción ligera de 2 segundos y luego suelta. La diferencia se vuelve obvia. Con el tiempo irás directo al soltar. Si acostado todavía no sale, prueba en cuatro puntos, como en la foto: con la cadera más arriba que el tronco, la gravedad ayuda a que el periné baje.</w:t>
       </w:r>
     </w:p>
     <w:p>
@@ -6105,7 +6105,7 @@
           <wp:inline distT="0" distB="0" distL="0" distR="0">
             <wp:extent cx="5334000" cy="3810000"/>
             <wp:effectExtent t="0" r="0" b="0" l="0"/>
-            <wp:docPr id="1" name="06-respiracao.png" descr="Inhala en 4 segundos, el abdomen sube y el periné se relaja. Exhala en 6, el abdomen baja." title="06-respiracao.png"/>
+            <wp:docPr id="1" name="06-respiracao.jpg" descr="Inhala en 4 segundos, el abdomen sube y el periné se relaja. Exhala en 6, el abdomen baja." title="06-respiracao.jpg"/>
             <wp:cNvGraphicFramePr>
               <a:graphicFrameLocks xmlns:a="http://schemas.openxmlformats.org/drawingml/2006/main" noChangeAspect="1"/>
             </wp:cNvGraphicFramePr>
@@ -7193,7 +7193,7 @@
           <wp:inline distT="0" distB="0" distL="0" distR="0">
             <wp:extent cx="5334000" cy="3810000"/>
             <wp:effectExtent t="0" r="0" b="0" l="0"/>
-            <wp:docPr id="1" name="07-agachamento.png" descr="Sentadilla profunda: talones en el piso, rodillas hacia afuera, tronco erguido." title="07-agachamento.png"/>
+            <wp:docPr id="1" name="07-agachamento.jpg" descr="Sentadilla: talones en el piso, tronco erguido. Baja lo que puedas; con la práctica, la cadera llega cerca de los talones." title="07-agachamento.jpg"/>
             <wp:cNvGraphicFramePr>
               <a:graphicFrameLocks xmlns:a="http://schemas.openxmlformats.org/drawingml/2006/main" noChangeAspect="1"/>
             </wp:cNvGraphicFramePr>
@@ -7242,7 +7242,7 @@
           <w:sz w:val="18"/>
           <w:szCs w:val="18"/>
         </w:rPr>
-        <w:t xml:space="preserve">Sentadilla profunda: talones en el piso, rodillas hacia afuera, tronco erguido.</w:t>
+        <w:t xml:space="preserve">Sentadilla: talones en el piso, tronco erguido. Baja lo que puedas; con la práctica, la cadera llega cerca de los talones.</w:t>
       </w:r>
     </w:p>
     <w:p>
@@ -7305,7 +7305,7 @@
           <w:sz w:val="22"/>
           <w:szCs w:val="22"/>
         </w:rPr>
-        <w:t xml:space="preserve">Tronco erguido, pecho abierto. Manos juntas frente al pecho, codos empujando suavemente las rodillas hacia afuera.</w:t>
+        <w:t xml:space="preserve">Tronco erguido, pecho abierto. Los brazos estirados al frente, como en la foto, ayudan al equilibrio; cuando ya bajes profundo, junta las manos frente al pecho y usa los codos para empujar suavemente las rodillas hacia afuera.</w:t>
       </w:r>
     </w:p>
     <w:p>
@@ -7568,7 +7568,7 @@
           <wp:inline distT="0" distB="0" distL="0" distR="0">
             <wp:extent cx="5334000" cy="3810000"/>
             <wp:effectExtent t="0" r="0" b="0" l="0"/>
-            <wp:docPr id="1" name="08-borboleta.png" descr="Mariposa: plantas de los pies juntas, rodillas cayendo hacia los lados con su propio peso." title="08-borboleta.png"/>
+            <wp:docPr id="1" name="08-borboleta.jpg" descr="Mariposa: plantas de los pies juntas, rodillas cayendo hacia los lados con su propio peso." title="08-borboleta.jpg"/>
             <wp:cNvGraphicFramePr>
               <a:graphicFrameLocks xmlns:a="http://schemas.openxmlformats.org/drawingml/2006/main" noChangeAspect="1"/>
             </wp:cNvGraphicFramePr>
@@ -7914,7 +7914,7 @@
           <wp:inline distT="0" distB="0" distL="0" distR="0">
             <wp:extent cx="5334000" cy="3810000"/>
             <wp:effectExtent t="0" r="0" b="0" l="0"/>
-            <wp:docPr id="1" name="09-flexor-quadril.png" descr="Flexor de cadera: hincado, una pierna al frente, la cadera avanzando con el tronco erguido." title="09-flexor-quadril.png"/>
+            <wp:docPr id="1" name="09-flexor-quadril.jpg" descr="Flexor de cadera: hincado, una pierna al frente, la cadera avanzando con el tronco erguido." title="09-flexor-quadril.jpg"/>
             <wp:cNvGraphicFramePr>
               <a:graphicFrameLocks xmlns:a="http://schemas.openxmlformats.org/drawingml/2006/main" noChangeAspect="1"/>
             </wp:cNvGraphicFramePr>
@@ -8874,7 +8874,7 @@
           <wp:inline distT="0" distB="0" distL="0" distR="0">
             <wp:extent cx="5334000" cy="3810000"/>
             <wp:effectExtent t="0" r="0" b="0" l="0"/>
-            <wp:docPr id="1" name="10-prancha.png" descr="Plancha sobre los antebrazos, cuerpo recto. En la exhalación, periné y abdomen contraen suave." title="10-prancha.png"/>
+            <wp:docPr id="1" name="10-prancha.jpg" descr="Plancha con los brazos estirados, cuerpo recto. En la exhalación, periné y abdomen contraen suave. Sobre los antebrazos, el patrón es el mismo." title="10-prancha.jpg"/>
             <wp:cNvGraphicFramePr>
               <a:graphicFrameLocks xmlns:a="http://schemas.openxmlformats.org/drawingml/2006/main" noChangeAspect="1"/>
             </wp:cNvGraphicFramePr>
@@ -8923,7 +8923,7 @@
           <w:sz w:val="18"/>
           <w:szCs w:val="18"/>
         </w:rPr>
-        <w:t xml:space="preserve">Plancha sobre los antebrazos, cuerpo recto. En la exhalación, periné y abdomen contraen suave.</w:t>
+        <w:t xml:space="preserve">Plancha con los brazos estirados, cuerpo recto. En la exhalación, periné y abdomen contraen suave. Sobre los antebrazos, el patrón es el mismo.</w:t>
       </w:r>
     </w:p>
     <w:p>
@@ -8940,7 +8940,7 @@
           <w:sz w:val="22"/>
           <w:szCs w:val="22"/>
         </w:rPr>
-        <w:t xml:space="preserve">Antebrazos en el piso, codos debajo de los hombros, puntas de los pies en el piso.</w:t>
+        <w:t xml:space="preserve">Manos en el piso debajo de los hombros y brazos estirados, como en la foto. Si te duele la muñeca, apoya los antebrazos con los codos debajo de los hombros. Puntas de los pies en el piso.</w:t>
       </w:r>
     </w:p>
     <w:p>
@@ -9127,7 +9127,7 @@
           <w:sz w:val="22"/>
           <w:szCs w:val="22"/>
         </w:rPr>
-        <w:t xml:space="preserve">Codos bajo los hombros y cuello en línea con el cuerpo, sin peso en la nuca.</w:t>
+        <w:t xml:space="preserve">Manos o codos bajo los hombros y cuello en línea con el cuerpo, sin peso en la nuca.</w:t>
       </w:r>
     </w:p>
     <w:p>

</xml_diff>